<commit_message>
Docs/Exhibit 11A: record RegMap published locations (HF/GHCR/Release)
Turn "publishable" into published, with concrete links:
- Root README: RegMap "released as an open model" (HF stetteh/regmap-embedder,
  GHCR docker run, GitHub Release v0.1-regmap).
- Exhibit 11A: distribution row + a Public Availability section with the three URLs.
- Model card (README.md): "Where to get it" (HF / Docker / Release); re-uploaded to HF.
- PUBLISHING.md: placeholders filled with the actual identities (stetteh / samuelgtetteh).

Co-Authored-By: Claude Opus 4.8 (1M context) <noreply@anthropic.com>
</commit_message>
<xml_diff>
--- a/exhibits/Exhibit 11A RegMap Reusable Published Model.docx
+++ b/exhibits/Exhibit 11A RegMap Reusable Published Model.docx
@@ -196,7 +196,7 @@
           </w:tcPr>
           <w:p>
             <w:r>
-              <w:t>Distribution</w:t>
+              <w:t>Distribution (published)</w:t>
             </w:r>
           </w:p>
         </w:tc>
@@ -206,12 +206,53 @@
           </w:tcPr>
           <w:p>
             <w:r>
-              <w:t>Publishable to the Hugging Face Hub or as a self-contained release archive; reproducible from the public repository via a release build script.</w:t>
+              <w:t>Released publicly on the Hugging Face Hub (huggingface.co/stetteh/regmap-embedder), as a downloadable GitHub Release (v0.1-regmap), and as a runnable Docker image (ghcr.io/samuelgtetteh/regmap-embedder) that serves the mapping over an API.</w:t>
             </w:r>
           </w:p>
         </w:tc>
       </w:tr>
     </w:tbl>
+    <w:p>
+      <w:pPr>
+        <w:pStyle w:val="Heading1"/>
+      </w:pPr>
+      <w:r>
+        <w:t>2a. Public availability</w:t>
+      </w:r>
+    </w:p>
+    <w:p>
+      <w:r>
+        <w:rPr>
+          <w:b w:val="0"/>
+          <w:i w:val="0"/>
+        </w:rPr>
+        <w:t>RegMap is now publicly available for anyone to use immediately, through three channels:</w:t>
+      </w:r>
+    </w:p>
+    <w:p>
+      <w:pPr>
+        <w:pStyle w:val="ListBullet"/>
+      </w:pPr>
+      <w:r>
+        <w:t>Hugging Face Hub — https://huggingface.co/stetteh/regmap-embedder (load with one line of sentence-transformers).</w:t>
+      </w:r>
+    </w:p>
+    <w:p>
+      <w:pPr>
+        <w:pStyle w:val="ListBullet"/>
+      </w:pPr>
+      <w:r>
+        <w:t>GitHub Release v0.1-regmap — a self-contained archive (model + HIPAA corpus + inference wrapper) that runs offline.</w:t>
+      </w:r>
+    </w:p>
+    <w:p>
+      <w:pPr>
+        <w:pStyle w:val="ListBullet"/>
+      </w:pPr>
+      <w:r>
+        <w:t>Docker image — ghcr.io/samuelgtetteh/regmap-embedder:0.1, a serving container exposing a POST /map endpoint that returns the top-ranked HIPAA provisions for a NIST control.</w:t>
+      </w:r>
+    </w:p>
     <w:p>
       <w:pPr>
         <w:pStyle w:val="Heading1"/>

</xml_diff>